<commit_message>
Lab 3 implementation (Variant 3)
</commit_message>
<xml_diff>
--- a/lab_03/Звіт_ЛР03.docx
+++ b/lab_03/Звіт_ЛР03.docx
@@ -529,7 +529,7 @@
     </w:p>
     <w:p>
       <w:r>
-        <w:t>Опанувати ітераційну модель Python, навчитися створювати власні генератори, використовувати протокол ітераторів та будувати ліниві (lazy) конвеєри для обробки потоків даних без повного завантаження в оперативну пам'ять.</w:t>
+        <w:t>Сформувати практичні навички роботи з ітераційною моделлю Python, ітераторами, генераторами, yield, generator expressions, модулем itertools та принципом lazy evaluation при побудові потокових конвеєрів обробки даних.</w:t>
       </w:r>
     </w:p>
     <w:p>
@@ -542,32 +542,37 @@
     </w:p>
     <w:p>
       <w:r>
-        <w:t>Для виконання завдання варіант №3 було побудовано пайплайн, що складається з чотирьох основних етапів:</w:t>
+        <w:t>варіант №3 передбачає обробку потоку даних (транзакцій). Архітектура реалізована як "Lazy Pipeline":</w:t>
       </w:r>
     </w:p>
     <w:p>
       <w:r>
-        <w:t>1. **Джерело (Producer):** Генератор `generate_mock_data`, що імітує потокове надходження даних.</w:t>
+        <w:t>1. **Source**: Генератор `infinite_transaction_generator` створює нескінченний потік об'єктів.</w:t>
       </w:r>
     </w:p>
     <w:p>
       <w:r>
-        <w:t>2. **Парсинг:** Функція `stream_reader`, яка перетворює "сирі" рядки на структуру даних (словник).</w:t>
+        <w:t>2. **Intermediate stages**:</w:t>
       </w:r>
     </w:p>
     <w:p>
       <w:r>
-        <w:t>3. **Фільтрація:** `filter_success` відсіює невдалі транзакції за допомогою генераторного виразу.</w:t>
+        <w:t>- `filter_successful`: Відсікає невдалі транзакції.</w:t>
       </w:r>
     </w:p>
     <w:p>
       <w:r>
-        <w:t>4. **Трансформація:** `apply_tax` виконує бізнес-логіку обчислення податку.</w:t>
+        <w:t>- `apply_cashback`: Змінює стан об'єкта (додає 10% до суми) за допомогою `yield`.</w:t>
       </w:r>
     </w:p>
     <w:p>
       <w:r>
-        <w:t>5. **Агрегація:** Використано `itertools.groupby` для підрахунку суми по групах.</w:t>
+        <w:t>- `filter_high_value`: Відфільтровує транзакції за пороговим значенням.</w:t>
+      </w:r>
+    </w:p>
+    <w:p>
+      <w:r>
+        <w:t>3. **Termination**: `itertools.islice` обмежує нескінченний потік 5 елементами для виведення.</w:t>
       </w:r>
     </w:p>
     <w:p>
@@ -580,22 +585,27 @@
     </w:p>
     <w:p>
       <w:r>
-        <w:t>- `generate_mock_data(n)`: Генераторна функція, що створює тестовий потік даних (замість читання з файлу).</w:t>
+        <w:t>- `Transaction`: Клас для представлення структури даних транзакції.</w:t>
       </w:r>
     </w:p>
     <w:p>
       <w:r>
-        <w:t>- `stream_reader(source)`: Функція, що обробляє потік рядків та повертає ітератор словників.</w:t>
+        <w:t>- `infinite_transaction_generator()`: Генератор, що імітує постійний потік даних.</w:t>
       </w:r>
     </w:p>
     <w:p>
       <w:r>
-        <w:t>- `filter_success(data)`: Фільтратор, що використовує `yield from` для передачі лише успішних транзакцій.</w:t>
+        <w:t>- `filter_successful()`: Використовує generator expression для ледачої фільтрації.</w:t>
       </w:r>
     </w:p>
     <w:p>
       <w:r>
-        <w:t>- `apply_tax(data)`: Генератор, що змінює значення `amount` залежно від умови, демонструючи lazy transformation.</w:t>
+        <w:t>- `apply_cashback()`: Функція-генератор, що демонструє покрокову зміну даних.</w:t>
+      </w:r>
+    </w:p>
+    <w:p>
+      <w:r>
+        <w:t>- `filter_high_value()`: Використовує вбудовану функцію `filter` для lazy evaluation.</w:t>
       </w:r>
     </w:p>
     <w:p>
@@ -608,7 +618,7 @@
     </w:p>
     <w:p>
       <w:r>
-        <w:t>Програма успішно обробляє потік даних, застосовуючи фільтрацію та податкові нарахування. Завдяки використанню ітераторів, на кожному етапі в пам'яті знаходиться лише один елемент (або поточна група), а не весь масив даних.</w:t>
+        <w:t>Програма успішно ініціалізує конвеєр, обробляє нескінченний потік, не завантажуючи його в пам'ять повністю, і видає перші 5 транзакцій, що відповідають критеріям (статус "success" та сума &gt; 500 після кешбеку).</w:t>
       </w:r>
     </w:p>
     <w:p>
@@ -621,7 +631,7 @@
     </w:p>
     <w:p>
       <w:r>
-        <w:t>У ході роботи було доведено ефективність lazy evaluation. Використання генераторів дозволяє будувати конвеєри, які споживають мінімальну кількість пам'яті навіть при обробці великих наборів даних. Завдяки модулю `itertools` (зокрема `groupby`), складні операції групування стають лаконічними та продуктивними. Встановлено, що ключем до потокової обробки є уникнення операцій, які потребують повного зрізу (матеріалізації) даних.</w:t>
+        <w:t>У ході лабораторної роботи було освоєно механізми `iter`, `next`, `yield`. Реалізація через lazy evaluation дозволяє ефективно обробляти великі (або нескінченні) набори даних, мінімізуючи використання оперативної пам'яті, оскільки кожен елемент проходить через конвеєр обробки індивідуально. Використання `itertools` дозволяє спростити роботу з ітераторами та керувати нескінченними потоками даних.</w:t>
       </w:r>
     </w:p>
     <w:sectPr>

</xml_diff>